<commit_message>
Setup guide: stop npm run dev before running tests
Co-Authored-By: Claude Opus 5.5 <noreply@anthropic.com>
</commit_message>
<xml_diff>
--- a/docs/Instrukcja przygotowania - Szybki feedback w CICD.docx
+++ b/docs/Instrukcja przygotowania - Szybki feedback w CICD.docx
@@ -1359,6 +1359,40 @@
             <w:tcW w:type="dxa" w:w="4968"/>
           </w:tcPr>
           <w:p>
+            <w:r>
+              <w:t>Testy UI wiszą albo kończą się błędem, a w innym terminalu działa npm run dev</w:t>
+            </w:r>
+            <w:r>
+              <w:rPr>
+                <w:b w:val="0"/>
+                <w:sz w:val="20"/>
+              </w:rPr>
+            </w:r>
+          </w:p>
+        </w:tc>
+        <w:tc>
+          <w:tcPr>
+            <w:tcW w:type="dxa" w:w="4968"/>
+          </w:tcPr>
+          <w:p>
+            <w:r>
+              <w:t>Zatrzymaj npm run dev (Ctrl+C) przed uruchomieniem testów. Playwright podłącza się wtedy do już działającego serwera deweloperskiego, pod którym nie ma frontendu, zamiast uruchomić własną aplikację.</w:t>
+            </w:r>
+            <w:r>
+              <w:rPr>
+                <w:b w:val="0"/>
+                <w:sz w:val="20"/>
+              </w:rPr>
+            </w:r>
+          </w:p>
+        </w:tc>
+      </w:tr>
+      <w:tr>
+        <w:tc>
+          <w:tcPr>
+            <w:tcW w:type="dxa" w:w="4968"/>
+          </w:tcPr>
+          <w:p>
             <w:r/>
             <w:r>
               <w:rPr>

</xml_diff>